<commit_message>
updated docs - data dictionary
</commit_message>
<xml_diff>
--- a/docs/write-up.docx
+++ b/docs/write-up.docx
@@ -36,13 +36,22 @@
           <w:b/>
           <w:bCs/>
         </w:rPr>
-        <w:t>Done during the process of making the db</w:t>
-      </w:r>
+        <w:t xml:space="preserve">Done during the process of making the </w:t>
+      </w:r>
+      <w:proofErr w:type="spellStart"/>
       <w:r>
         <w:rPr>
           <w:b/>
           <w:bCs/>
         </w:rPr>
+        <w:t>db</w:t>
+      </w:r>
+      <w:proofErr w:type="spellEnd"/>
+      <w:r>
+        <w:rPr>
+          <w:b/>
+          <w:bCs/>
+        </w:rPr>
         <w:t>)</w:t>
       </w:r>
     </w:p>
@@ -53,8 +62,13 @@
       <w:r>
         <w:t xml:space="preserve">and </w:t>
       </w:r>
-      <w:r>
-        <w:t>gene_panel_matrix data</w:t>
+      <w:proofErr w:type="spellStart"/>
+      <w:r>
+        <w:t>gene_panel_matrix</w:t>
+      </w:r>
+      <w:proofErr w:type="spellEnd"/>
+      <w:r>
+        <w:t xml:space="preserve"> data</w:t>
       </w:r>
       <w:r>
         <w:t xml:space="preserve"> along with the meta data were excluded from the </w:t>
@@ -336,71 +350,56 @@
       </w:r>
     </w:p>
     <w:p/>
-    <w:p>
-      <w:r>
-        <w:t>For the MAF file</w:t>
-      </w:r>
-      <w:r>
-        <w:t xml:space="preserve">, </w:t>
-      </w:r>
-      <w:r>
-        <w:t xml:space="preserve">only </w:t>
-      </w:r>
-      <w:r>
-        <w:t xml:space="preserve">data that was </w:t>
-      </w:r>
-      <w:r>
-        <w:t>relevant to the mutation</w:t>
-      </w:r>
-      <w:r>
-        <w:t xml:space="preserve">/variant were kept. </w:t>
-      </w:r>
-      <w:r>
-        <w:t xml:space="preserve">The dbSNPs </w:t>
-      </w:r>
-      <w:r>
-        <w:t xml:space="preserve">were not </w:t>
-      </w:r>
-      <w:r>
-        <w:t>isolated into a s</w:t>
-      </w:r>
-      <w:r>
-        <w:t>epa</w:t>
-      </w:r>
-      <w:r>
-        <w:t>rate datab</w:t>
-      </w:r>
-      <w:r>
-        <w:t>a</w:t>
-      </w:r>
-      <w:r>
-        <w:t xml:space="preserve">se. Although </w:t>
-      </w:r>
-      <w:r>
-        <w:t xml:space="preserve">they could feasibly change for the variant, </w:t>
-      </w:r>
-      <w:r>
-        <w:t>in the event they did</w:t>
-      </w:r>
-      <w:r>
-        <w:t>,</w:t>
-      </w:r>
-      <w:r>
-        <w:t xml:space="preserve"> it is likely that the </w:t>
-      </w:r>
-      <w:r>
-        <w:t xml:space="preserve">old </w:t>
-      </w:r>
-      <w:r>
-        <w:t xml:space="preserve">rsID would still redirect to the </w:t>
-      </w:r>
-      <w:r>
-        <w:t xml:space="preserve">updated rsID. </w:t>
-      </w:r>
-    </w:p>
-    <w:p>
-      <w:r>
-        <w:t>Dropped Columns:</w:t>
+    <w:p/>
+    <w:p>
+      <w:pPr>
+        <w:jc w:val="center"/>
+        <w:rPr>
+          <w:b/>
+        </w:rPr>
+      </w:pPr>
+      <w:r>
+        <w:rPr>
+          <w:b/>
+        </w:rPr>
+        <w:t>AC</w:t>
+      </w:r>
+      <w:r>
+        <w:rPr>
+          <w:b/>
+        </w:rPr>
+        <w:t>TUAL PROJECT</w:t>
+      </w:r>
+    </w:p>
+    <w:p>
+      <w:pPr>
+        <w:rPr>
+          <w:b/>
+          <w:bCs/>
+        </w:rPr>
+      </w:pPr>
+    </w:p>
+    <w:p>
+      <w:r>
+        <w:rPr>
+          <w:b/>
+          <w:bCs/>
+        </w:rPr>
+        <w:t xml:space="preserve">Project </w:t>
+      </w:r>
+      <w:r>
+        <w:rPr>
+          <w:b/>
+          <w:bCs/>
+        </w:rPr>
+        <w:t>o</w:t>
+      </w:r>
+      <w:r>
+        <w:rPr>
+          <w:b/>
+          <w:bCs/>
+        </w:rPr>
+        <w:t>verview</w:t>
       </w:r>
     </w:p>
     <w:p>
@@ -412,7 +411,158 @@
         </w:numPr>
       </w:pPr>
       <w:r>
-        <w:t>Hotspot – no hotspots were identified</w:t>
+        <w:t xml:space="preserve">What problem the </w:t>
+      </w:r>
+      <w:r>
+        <w:t>database</w:t>
+      </w:r>
+      <w:r>
+        <w:t xml:space="preserve"> solves, who it is for, and what the final database contains</w:t>
+      </w:r>
+    </w:p>
+    <w:p>
+      <w:pPr>
+        <w:ind w:left="360"/>
+      </w:pPr>
+    </w:p>
+    <w:p>
+      <w:r>
+        <w:t xml:space="preserve">This project was </w:t>
+      </w:r>
+      <w:r>
+        <w:t>completed as the final project</w:t>
+      </w:r>
+      <w:r>
+        <w:t xml:space="preserve"> of the database class</w:t>
+      </w:r>
+      <w:r>
+        <w:t xml:space="preserve"> (</w:t>
+      </w:r>
+      <w:r>
+        <w:t>BINF-6970</w:t>
+      </w:r>
+      <w:r>
+        <w:t>)</w:t>
+      </w:r>
+      <w:r>
+        <w:t xml:space="preserve"> at Georgetown University, designed to give experience with </w:t>
+      </w:r>
+      <w:r>
+        <w:t xml:space="preserve">data </w:t>
+      </w:r>
+      <w:r>
+        <w:t>cleaning</w:t>
+      </w:r>
+      <w:r>
+        <w:t xml:space="preserve">, formatting, </w:t>
+      </w:r>
+      <w:r>
+        <w:t xml:space="preserve">and </w:t>
+      </w:r>
+      <w:r>
+        <w:lastRenderedPageBreak/>
+        <w:t>creation of an SQL datab</w:t>
+      </w:r>
+      <w:r>
+        <w:t>a</w:t>
+      </w:r>
+      <w:r>
+        <w:t>se.</w:t>
+      </w:r>
+      <w:r>
+        <w:t xml:space="preserve"> </w:t>
+      </w:r>
+      <w:r>
+        <w:t xml:space="preserve">The goal of the database is to be used to look at “interesting” mutations and genomic events from </w:t>
+      </w:r>
+      <w:r>
+        <w:t xml:space="preserve">a metastatic prostate adenocarcinoma </w:t>
+      </w:r>
+      <w:proofErr w:type="spellStart"/>
+      <w:r>
+        <w:t>cBioPortal</w:t>
+      </w:r>
+      <w:proofErr w:type="spellEnd"/>
+      <w:r>
+        <w:t xml:space="preserve">, </w:t>
+      </w:r>
+      <w:r>
+        <w:t>conducted</w:t>
+      </w:r>
+      <w:r>
+        <w:t xml:space="preserve"> by the Prostate Cancer Foundation (PMID:</w:t>
+      </w:r>
+      <w:r>
+        <w:t xml:space="preserve"> </w:t>
+      </w:r>
+      <w:r>
+        <w:t>31061129</w:t>
+      </w:r>
+      <w:r>
+        <w:t>)</w:t>
+      </w:r>
+      <w:r>
+        <w:t xml:space="preserve">. </w:t>
+      </w:r>
+    </w:p>
+    <w:p>
+      <w:r>
+        <w:t>The final datab</w:t>
+      </w:r>
+      <w:r>
+        <w:t>a</w:t>
+      </w:r>
+      <w:r>
+        <w:t xml:space="preserve">se contains </w:t>
+      </w:r>
+      <w:r>
+        <w:t xml:space="preserve">cleaned clinical data about the </w:t>
+      </w:r>
+      <w:r>
+        <w:t>429</w:t>
+      </w:r>
+      <w:r>
+        <w:t xml:space="preserve"> patients and </w:t>
+      </w:r>
+      <w:r>
+        <w:t>444</w:t>
+      </w:r>
+      <w:r>
+        <w:t xml:space="preserve"> samples</w:t>
+      </w:r>
+      <w:r>
+        <w:t xml:space="preserve">, along with </w:t>
+      </w:r>
+      <w:r>
+        <w:t>sample expression</w:t>
+      </w:r>
+      <w:r>
+        <w:t xml:space="preserve">, </w:t>
+      </w:r>
+      <w:r>
+        <w:t>mutation</w:t>
+      </w:r>
+      <w:r>
+        <w:t xml:space="preserve">, and </w:t>
+      </w:r>
+      <w:r>
+        <w:t>copy number alteration</w:t>
+      </w:r>
+      <w:r>
+        <w:t xml:space="preserve"> </w:t>
+      </w:r>
+      <w:r>
+        <w:t xml:space="preserve">data. </w:t>
+      </w:r>
+    </w:p>
+    <w:p/>
+    <w:p>
+      <w:r>
+        <w:rPr>
+          <w:b/>
+          <w:bCs/>
+        </w:rPr>
+        <w:t>Data source</w:t>
       </w:r>
     </w:p>
     <w:p>
@@ -424,390 +574,6 @@
         </w:numPr>
       </w:pPr>
       <w:r>
-        <w:t xml:space="preserve">Tag, n_ref, n_alt, </w:t>
-      </w:r>
-      <w:r>
-        <w:t xml:space="preserve">validation_status, </w:t>
-      </w:r>
-      <w:r>
-        <w:t>SCORE, BAM_FILE</w:t>
-      </w:r>
-      <w:r>
-        <w:t xml:space="preserve">, </w:t>
-      </w:r>
-    </w:p>
-    <w:p/>
-    <w:p/>
-    <w:p>
-      <w:r>
-        <w:t>Data Cleaning</w:t>
-      </w:r>
-    </w:p>
-    <w:p>
-      <w:pPr>
-        <w:pStyle w:val="ListParagraph"/>
-        <w:numPr>
-          <w:ilvl w:val="0"/>
-          <w:numId w:val="1"/>
-        </w:numPr>
-      </w:pPr>
-      <w:r>
-        <w:lastRenderedPageBreak/>
-        <w:t xml:space="preserve">MAF file – dbSNPids sometimes have multiple rsID accession numbers. </w:t>
-      </w:r>
-    </w:p>
-    <w:p>
-      <w:pPr>
-        <w:pStyle w:val="ListParagraph"/>
-        <w:numPr>
-          <w:ilvl w:val="0"/>
-          <w:numId w:val="1"/>
-        </w:numPr>
-      </w:pPr>
-      <w:r>
-        <w:t>Take only the first occur</w:t>
-      </w:r>
-      <w:r>
-        <w:t>re</w:t>
-      </w:r>
-      <w:r>
-        <w:t>nce</w:t>
-      </w:r>
-    </w:p>
-    <w:p>
-      <w:pPr>
-        <w:pStyle w:val="ListParagraph"/>
-        <w:numPr>
-          <w:ilvl w:val="1"/>
-          <w:numId w:val="1"/>
-        </w:numPr>
-      </w:pPr>
-      <w:r>
-        <w:t xml:space="preserve">I’m assuming that </w:t>
-      </w:r>
-      <w:r>
-        <w:t>all the rsID</w:t>
-      </w:r>
-      <w:r>
-        <w:t>s</w:t>
-      </w:r>
-      <w:r>
-        <w:t xml:space="preserve"> refer to the same </w:t>
-      </w:r>
-      <w:r>
-        <w:t>genomic event</w:t>
-      </w:r>
-      <w:r>
-        <w:t xml:space="preserve">, </w:t>
-      </w:r>
-      <w:r>
-        <w:t>and that some are either outdated</w:t>
-      </w:r>
-      <w:r>
-        <w:t>, depr</w:t>
-      </w:r>
-      <w:r>
-        <w:t>eca</w:t>
-      </w:r>
-      <w:r>
-        <w:t xml:space="preserve">ted, or </w:t>
-      </w:r>
-      <w:r>
-        <w:t xml:space="preserve">have since been merged. </w:t>
-      </w:r>
-    </w:p>
-    <w:p/>
-    <w:p/>
-    <w:p>
-      <w:pPr>
-        <w:pStyle w:val="ListParagraph"/>
-        <w:numPr>
-          <w:ilvl w:val="0"/>
-          <w:numId w:val="1"/>
-        </w:numPr>
-      </w:pPr>
-      <w:r>
-        <w:t>F</w:t>
-      </w:r>
-      <w:r>
-        <w:t>PKM and CNA</w:t>
-      </w:r>
-      <w:r>
-        <w:t xml:space="preserve"> inserters</w:t>
-      </w:r>
-    </w:p>
-    <w:p>
-      <w:pPr>
-        <w:pStyle w:val="ListParagraph"/>
-        <w:numPr>
-          <w:ilvl w:val="1"/>
-          <w:numId w:val="1"/>
-        </w:numPr>
-      </w:pPr>
-      <w:r>
-        <w:t xml:space="preserve">If a gene is not in the geneInfo </w:t>
-      </w:r>
-      <w:r>
-        <w:t xml:space="preserve">table, </w:t>
-      </w:r>
-      <w:r>
-        <w:t xml:space="preserve">a new </w:t>
-      </w:r>
-      <w:r>
-        <w:t xml:space="preserve">entry is created based on the Hugo gene symbol and a blank </w:t>
-      </w:r>
-      <w:r>
-        <w:t xml:space="preserve">(0) </w:t>
-      </w:r>
-      <w:r>
-        <w:t>entrezID</w:t>
-      </w:r>
-      <w:r>
-        <w:t xml:space="preserve">. </w:t>
-      </w:r>
-    </w:p>
-    <w:p>
-      <w:pPr>
-        <w:pStyle w:val="ListParagraph"/>
-        <w:numPr>
-          <w:ilvl w:val="1"/>
-          <w:numId w:val="1"/>
-        </w:numPr>
-      </w:pPr>
-      <w:r>
-        <w:t xml:space="preserve">The blank entrezID could be updated later </w:t>
-      </w:r>
-      <w:r>
-        <w:t>if one desires.</w:t>
-      </w:r>
-    </w:p>
-    <w:p/>
-    <w:p>
-      <w:r>
-        <w:br w:type="page"/>
-      </w:r>
-    </w:p>
-    <w:p>
-      <w:pPr>
-        <w:jc w:val="center"/>
-        <w:rPr>
-          <w:b/>
-        </w:rPr>
-      </w:pPr>
-      <w:r>
-        <w:rPr>
-          <w:b/>
-        </w:rPr>
-        <w:lastRenderedPageBreak/>
-        <w:t>AC</w:t>
-      </w:r>
-      <w:r>
-        <w:rPr>
-          <w:b/>
-        </w:rPr>
-        <w:t>TUAL PROJECT</w:t>
-      </w:r>
-    </w:p>
-    <w:p>
-      <w:pPr>
-        <w:rPr>
-          <w:b/>
-          <w:bCs/>
-        </w:rPr>
-      </w:pPr>
-    </w:p>
-    <w:p>
-      <w:r>
-        <w:rPr>
-          <w:b/>
-          <w:bCs/>
-        </w:rPr>
-        <w:t xml:space="preserve">Project </w:t>
-      </w:r>
-      <w:r>
-        <w:rPr>
-          <w:b/>
-          <w:bCs/>
-        </w:rPr>
-        <w:t>o</w:t>
-      </w:r>
-      <w:r>
-        <w:rPr>
-          <w:b/>
-          <w:bCs/>
-        </w:rPr>
-        <w:t>verview</w:t>
-      </w:r>
-    </w:p>
-    <w:p>
-      <w:pPr>
-        <w:pStyle w:val="ListParagraph"/>
-        <w:numPr>
-          <w:ilvl w:val="0"/>
-          <w:numId w:val="1"/>
-        </w:numPr>
-      </w:pPr>
-      <w:r>
-        <w:t xml:space="preserve">What problem the </w:t>
-      </w:r>
-      <w:r>
-        <w:t>database</w:t>
-      </w:r>
-      <w:r>
-        <w:t xml:space="preserve"> solves, who it is for, and what the final database contains</w:t>
-      </w:r>
-    </w:p>
-    <w:p>
-      <w:pPr>
-        <w:ind w:left="360"/>
-      </w:pPr>
-    </w:p>
-    <w:p>
-      <w:r>
-        <w:t xml:space="preserve">This project was </w:t>
-      </w:r>
-      <w:r>
-        <w:t>completed as the final project</w:t>
-      </w:r>
-      <w:r>
-        <w:t xml:space="preserve"> of the database class</w:t>
-      </w:r>
-      <w:r>
-        <w:t xml:space="preserve"> (</w:t>
-      </w:r>
-      <w:r>
-        <w:t>BINF-6970</w:t>
-      </w:r>
-      <w:r>
-        <w:t>)</w:t>
-      </w:r>
-      <w:r>
-        <w:t xml:space="preserve"> at Georgetown University, designed to give experience with </w:t>
-      </w:r>
-      <w:r>
-        <w:t xml:space="preserve">data </w:t>
-      </w:r>
-      <w:r>
-        <w:t>cleaning</w:t>
-      </w:r>
-      <w:r>
-        <w:t xml:space="preserve">, formatting, </w:t>
-      </w:r>
-      <w:r>
-        <w:t xml:space="preserve">and </w:t>
-      </w:r>
-      <w:r>
-        <w:t>creation of an SQL datab</w:t>
-      </w:r>
-      <w:r>
-        <w:t>a</w:t>
-      </w:r>
-      <w:r>
-        <w:t>se.</w:t>
-      </w:r>
-      <w:r>
-        <w:t xml:space="preserve"> </w:t>
-      </w:r>
-      <w:r>
-        <w:t xml:space="preserve">The goal of the database is to be used to look at “interesting” mutations and genomic events from </w:t>
-      </w:r>
-      <w:r>
-        <w:t xml:space="preserve">a metastatic prostate adenocarcinoma </w:t>
-      </w:r>
-      <w:r>
-        <w:t>cBioPortal</w:t>
-      </w:r>
-      <w:r>
-        <w:t xml:space="preserve">, </w:t>
-      </w:r>
-      <w:r>
-        <w:t>conducted</w:t>
-      </w:r>
-      <w:r>
-        <w:t xml:space="preserve"> by the Prostate Cancer Foundation (PMID:</w:t>
-      </w:r>
-      <w:r>
-        <w:t xml:space="preserve"> </w:t>
-      </w:r>
-      <w:r>
-        <w:t>31061129</w:t>
-      </w:r>
-      <w:r>
-        <w:t>)</w:t>
-      </w:r>
-      <w:r>
-        <w:t xml:space="preserve">. </w:t>
-      </w:r>
-    </w:p>
-    <w:p>
-      <w:r>
-        <w:t>The final datab</w:t>
-      </w:r>
-      <w:r>
-        <w:t>a</w:t>
-      </w:r>
-      <w:r>
-        <w:t xml:space="preserve">se contains </w:t>
-      </w:r>
-      <w:r>
-        <w:t xml:space="preserve">cleaned clinical data about the </w:t>
-      </w:r>
-      <w:r>
-        <w:t>429</w:t>
-      </w:r>
-      <w:r>
-        <w:t xml:space="preserve"> patients and </w:t>
-      </w:r>
-      <w:r>
-        <w:t>444</w:t>
-      </w:r>
-      <w:r>
-        <w:t xml:space="preserve"> samples</w:t>
-      </w:r>
-      <w:r>
-        <w:t xml:space="preserve">, along with </w:t>
-      </w:r>
-      <w:r>
-        <w:t>sample expression</w:t>
-      </w:r>
-      <w:r>
-        <w:t xml:space="preserve">, </w:t>
-      </w:r>
-      <w:r>
-        <w:t>mutation</w:t>
-      </w:r>
-      <w:r>
-        <w:t xml:space="preserve">, and </w:t>
-      </w:r>
-      <w:r>
-        <w:t>copy number alteration</w:t>
-      </w:r>
-      <w:r>
-        <w:t xml:space="preserve"> </w:t>
-      </w:r>
-      <w:r>
-        <w:t xml:space="preserve">data. </w:t>
-      </w:r>
-    </w:p>
-    <w:p/>
-    <w:p>
-      <w:r>
-        <w:rPr>
-          <w:b/>
-          <w:bCs/>
-        </w:rPr>
-        <w:t>Data source</w:t>
-      </w:r>
-    </w:p>
-    <w:p>
-      <w:pPr>
-        <w:pStyle w:val="ListParagraph"/>
-        <w:numPr>
-          <w:ilvl w:val="0"/>
-          <w:numId w:val="1"/>
-        </w:numPr>
-      </w:pPr>
-      <w:r>
         <w:t>Where the data came from, file types, and restrictions</w:t>
       </w:r>
     </w:p>
@@ -831,12 +597,14 @@
         <w:t xml:space="preserve">study in </w:t>
       </w:r>
       <w:hyperlink r:id="rId5" w:history="1">
+        <w:proofErr w:type="spellStart"/>
         <w:r>
           <w:rPr>
             <w:rStyle w:val="Hyperlink"/>
           </w:rPr>
           <w:t>cBioPortal</w:t>
         </w:r>
+        <w:proofErr w:type="spellEnd"/>
       </w:hyperlink>
       <w:r>
         <w:t xml:space="preserve">, </w:t>
@@ -1057,9 +825,11 @@
           <w:numId w:val="1"/>
         </w:numPr>
       </w:pPr>
+      <w:proofErr w:type="spellStart"/>
       <w:r>
         <w:t>data_clinical_patient</w:t>
       </w:r>
+      <w:proofErr w:type="spellEnd"/>
     </w:p>
     <w:p>
       <w:pPr>
@@ -1070,7 +840,6 @@
         </w:numPr>
       </w:pPr>
       <w:r>
-        <w:lastRenderedPageBreak/>
         <w:t xml:space="preserve">PSA </w:t>
       </w:r>
       <w:r>
@@ -1127,9 +896,11 @@
           <w:numId w:val="1"/>
         </w:numPr>
       </w:pPr>
+      <w:proofErr w:type="spellStart"/>
       <w:r>
         <w:t>data_clinical_sample</w:t>
       </w:r>
+      <w:proofErr w:type="spellEnd"/>
     </w:p>
     <w:p>
       <w:pPr>
@@ -1242,9 +1013,11 @@
           <w:numId w:val="1"/>
         </w:numPr>
       </w:pPr>
+      <w:proofErr w:type="spellStart"/>
       <w:r>
         <w:t>data_clincial_patient</w:t>
       </w:r>
+      <w:proofErr w:type="spellEnd"/>
     </w:p>
     <w:p>
       <w:pPr>
@@ -1258,7 +1031,23 @@
         <w:t xml:space="preserve">NULL values were present for </w:t>
       </w:r>
       <w:r>
-        <w:t xml:space="preserve">both survivalStatus and overallSurvival. </w:t>
+        <w:t xml:space="preserve">both </w:t>
+      </w:r>
+      <w:proofErr w:type="spellStart"/>
+      <w:r>
+        <w:t>survivalStatus</w:t>
+      </w:r>
+      <w:proofErr w:type="spellEnd"/>
+      <w:r>
+        <w:t xml:space="preserve"> and </w:t>
+      </w:r>
+      <w:proofErr w:type="spellStart"/>
+      <w:r>
+        <w:t>overallSurvival</w:t>
+      </w:r>
+      <w:proofErr w:type="spellEnd"/>
+      <w:r>
+        <w:t xml:space="preserve">. </w:t>
       </w:r>
       <w:r>
         <w:t xml:space="preserve">The database </w:t>
@@ -1308,8 +1097,13 @@
           <w:numId w:val="1"/>
         </w:numPr>
       </w:pPr>
-      <w:r>
-        <w:t xml:space="preserve">DiagnosisAge also </w:t>
+      <w:proofErr w:type="spellStart"/>
+      <w:r>
+        <w:t>DiagnosisAge</w:t>
+      </w:r>
+      <w:proofErr w:type="spellEnd"/>
+      <w:r>
+        <w:t xml:space="preserve"> also </w:t>
       </w:r>
       <w:r>
         <w:t xml:space="preserve">accepts NULL </w:t>
@@ -1335,8 +1129,13 @@
           <w:numId w:val="1"/>
         </w:numPr>
       </w:pPr>
-      <w:r>
-        <w:t xml:space="preserve">SurvivalStatus of 0 corresponds to a “LIVING” status </w:t>
+      <w:proofErr w:type="spellStart"/>
+      <w:r>
+        <w:t>SurvivalStatus</w:t>
+      </w:r>
+      <w:proofErr w:type="spellEnd"/>
+      <w:r>
+        <w:t xml:space="preserve"> of 0 corresponds to a “LIVING” status </w:t>
       </w:r>
       <w:r>
         <w:t>of the patient.</w:t>
@@ -1375,16 +1174,7 @@
         </w:numPr>
       </w:pPr>
       <w:r>
-        <w:t xml:space="preserve">Some entries had multiple rsIDs recorded. </w:t>
-      </w:r>
-      <w:r>
-        <w:t xml:space="preserve">In these events, </w:t>
-      </w:r>
-      <w:r>
-        <w:t xml:space="preserve">I take only the first rsID. </w:t>
-      </w:r>
-      <w:r>
-        <w:t xml:space="preserve">I assumed that all the rsIDs refer to the same genomic event, and that some are either outdated, deprecated, or have since been merged. </w:t>
+        <w:t xml:space="preserve">Only information relevant to the observation, sample, and variant were kept; refer to the NF diagram for the exact columns kept. </w:t>
       </w:r>
     </w:p>
     <w:p>
@@ -1396,34 +1186,40 @@
         </w:numPr>
       </w:pPr>
       <w:r>
-        <w:t xml:space="preserve">Only </w:t>
-      </w:r>
-      <w:r>
-        <w:t xml:space="preserve">information relevant to the observation, sample, and variant </w:t>
-      </w:r>
-      <w:r>
-        <w:t>were kept</w:t>
-      </w:r>
-      <w:r>
-        <w:t>;</w:t>
-      </w:r>
-      <w:r>
-        <w:t xml:space="preserve"> refer to the </w:t>
-      </w:r>
-      <w:r>
-        <w:t xml:space="preserve">NF diagram for </w:t>
-      </w:r>
-      <w:r>
-        <w:t xml:space="preserve">the </w:t>
-      </w:r>
-      <w:r>
-        <w:t>exact columns</w:t>
-      </w:r>
-      <w:r>
-        <w:t xml:space="preserve"> kept</w:t>
-      </w:r>
+        <w:t xml:space="preserve">Some entries had multiple </w:t>
+      </w:r>
+      <w:proofErr w:type="spellStart"/>
+      <w:r>
+        <w:t>rsIDs</w:t>
+      </w:r>
+      <w:proofErr w:type="spellEnd"/>
+      <w:r>
+        <w:t xml:space="preserve"> recorded. </w:t>
+      </w:r>
+      <w:r>
+        <w:t xml:space="preserve">In these events, </w:t>
+      </w:r>
+      <w:r>
+        <w:t xml:space="preserve">I take only the first </w:t>
+      </w:r>
+      <w:proofErr w:type="spellStart"/>
+      <w:r>
+        <w:t>rsID</w:t>
+      </w:r>
+      <w:proofErr w:type="spellEnd"/>
       <w:r>
         <w:t xml:space="preserve">. </w:t>
+      </w:r>
+      <w:r>
+        <w:t xml:space="preserve">I assumed that all the </w:t>
+      </w:r>
+      <w:proofErr w:type="spellStart"/>
+      <w:r>
+        <w:t>rsIDs</w:t>
+      </w:r>
+      <w:proofErr w:type="spellEnd"/>
+      <w:r>
+        <w:t xml:space="preserve"> refer to the same genomic event, and that some are either outdated, deprecated, or have since been merged. </w:t>
       </w:r>
     </w:p>
     <w:p>
@@ -1526,7 +1322,6 @@
     </w:p>
     <w:p>
       <w:r>
-        <w:lastRenderedPageBreak/>
         <w:t xml:space="preserve">The reference </w:t>
       </w:r>
       <w:r>
@@ -1724,12 +1519,14 @@
         <w:t xml:space="preserve">SU2C data from </w:t>
       </w:r>
       <w:hyperlink r:id="rId7" w:history="1">
+        <w:proofErr w:type="spellStart"/>
         <w:r>
           <w:rPr>
             <w:rStyle w:val="Hyperlink"/>
           </w:rPr>
           <w:t>cBioPortal</w:t>
         </w:r>
+        <w:proofErr w:type="spellEnd"/>
       </w:hyperlink>
       <w:r>
         <w:t>,</w:t>
@@ -1832,10 +1629,31 @@
         <w:t xml:space="preserve">se. </w:t>
       </w:r>
       <w:r>
-        <w:t xml:space="preserve">The mRNA_capture and mRNA_polyA </w:t>
-      </w:r>
-      <w:r>
-        <w:t xml:space="preserve">fpkm </w:t>
+        <w:t xml:space="preserve">The </w:t>
+      </w:r>
+      <w:proofErr w:type="spellStart"/>
+      <w:r>
+        <w:t>mRNA_capture</w:t>
+      </w:r>
+      <w:proofErr w:type="spellEnd"/>
+      <w:r>
+        <w:t xml:space="preserve"> and </w:t>
+      </w:r>
+      <w:proofErr w:type="spellStart"/>
+      <w:r>
+        <w:t>mRNA_polyA</w:t>
+      </w:r>
+      <w:proofErr w:type="spellEnd"/>
+      <w:r>
+        <w:t xml:space="preserve"> </w:t>
+      </w:r>
+      <w:proofErr w:type="spellStart"/>
+      <w:r>
+        <w:t>fpkm</w:t>
+      </w:r>
+      <w:proofErr w:type="spellEnd"/>
+      <w:r>
+        <w:t xml:space="preserve"> </w:t>
       </w:r>
       <w:r>
         <w:t xml:space="preserve">data are processed in the same script </w:t>
@@ -1877,7 +1695,15 @@
         <w:t xml:space="preserve"> create </w:t>
       </w:r>
       <w:r>
-        <w:t xml:space="preserve">the geneInfo table, </w:t>
+        <w:t xml:space="preserve">the </w:t>
+      </w:r>
+      <w:proofErr w:type="spellStart"/>
+      <w:r>
+        <w:t>geneInfo</w:t>
+      </w:r>
+      <w:proofErr w:type="spellEnd"/>
+      <w:r>
+        <w:t xml:space="preserve"> table, </w:t>
       </w:r>
       <w:r>
         <w:t xml:space="preserve">storing </w:t>
@@ -1955,8 +1781,13 @@
         <w:t xml:space="preserve">, the </w:t>
       </w:r>
       <w:r>
-        <w:t>inserter will create a new entry in the geneInfo</w:t>
-      </w:r>
+        <w:t xml:space="preserve">inserter will create a new entry in the </w:t>
+      </w:r>
+      <w:proofErr w:type="spellStart"/>
+      <w:r>
+        <w:t>geneInfo</w:t>
+      </w:r>
+      <w:proofErr w:type="spellEnd"/>
       <w:r>
         <w:t xml:space="preserve"> with the </w:t>
       </w:r>
@@ -2010,7 +1841,15 @@
         <w:t xml:space="preserve">populate the database is to </w:t>
       </w:r>
       <w:r>
-        <w:t>run the “mydump.sql” file</w:t>
+        <w:t>run the “</w:t>
+      </w:r>
+      <w:proofErr w:type="spellStart"/>
+      <w:r>
+        <w:t>mydump.sql</w:t>
+      </w:r>
+      <w:proofErr w:type="spellEnd"/>
+      <w:r>
+        <w:t>” file</w:t>
       </w:r>
       <w:r>
         <w:t xml:space="preserve">. </w:t>
@@ -2073,11 +1912,7 @@
         <w:t>numerical order</w:t>
       </w:r>
       <w:r>
-        <w:t xml:space="preserve">, </w:t>
-      </w:r>
-      <w:r>
-        <w:lastRenderedPageBreak/>
-        <w:t>though this will take vastly longer than using the SQL dump</w:t>
+        <w:t>, though this will take vastly longer than using the SQL dump</w:t>
       </w:r>
       <w:r>
         <w:t xml:space="preserve">. </w:t>
@@ -2221,6 +2056,7 @@
         <w:t xml:space="preserve">, refer to </w:t>
       </w:r>
       <w:r>
+        <w:lastRenderedPageBreak/>
         <w:t xml:space="preserve">the script_execution.md file </w:t>
       </w:r>
       <w:r>
@@ -2245,7 +2081,15 @@
         <w:t xml:space="preserve">run the </w:t>
       </w:r>
       <w:r>
-        <w:t xml:space="preserve">“mydump.sql” file </w:t>
+        <w:t>“</w:t>
+      </w:r>
+      <w:proofErr w:type="spellStart"/>
+      <w:r>
+        <w:t>mydump.sql</w:t>
+      </w:r>
+      <w:proofErr w:type="spellEnd"/>
+      <w:r>
+        <w:t xml:space="preserve">” file </w:t>
       </w:r>
       <w:r>
         <w:t xml:space="preserve">to </w:t>
@@ -2385,7 +2229,15 @@
           </w:tcPr>
           <w:p>
             <w:r>
-              <w:t xml:space="preserve">Converts the data_mutation </w:t>
+              <w:t xml:space="preserve">Converts the </w:t>
+            </w:r>
+            <w:proofErr w:type="spellStart"/>
+            <w:r>
+              <w:t>data_mutation</w:t>
+            </w:r>
+            <w:proofErr w:type="spellEnd"/>
+            <w:r>
+              <w:t xml:space="preserve"> </w:t>
             </w:r>
             <w:r>
               <w:t xml:space="preserve">file to </w:t>
@@ -2400,7 +2252,15 @@
               <w:t xml:space="preserve">the variant, observation, </w:t>
             </w:r>
             <w:r>
-              <w:t xml:space="preserve">and geneInfo tables </w:t>
+              <w:t xml:space="preserve">and </w:t>
+            </w:r>
+            <w:proofErr w:type="spellStart"/>
+            <w:r>
+              <w:t>geneInfo</w:t>
+            </w:r>
+            <w:proofErr w:type="spellEnd"/>
+            <w:r>
+              <w:t xml:space="preserve"> tables </w:t>
             </w:r>
             <w:r>
               <w:t xml:space="preserve">with mutation data. </w:t>
@@ -2425,7 +2285,23 @@
           </w:tcPr>
           <w:p>
             <w:r>
-              <w:t xml:space="preserve">Converts the mrna_poly and mrna_capture data </w:t>
+              <w:t xml:space="preserve">Converts the </w:t>
+            </w:r>
+            <w:proofErr w:type="spellStart"/>
+            <w:r>
+              <w:t>mrna_poly</w:t>
+            </w:r>
+            <w:proofErr w:type="spellEnd"/>
+            <w:r>
+              <w:t xml:space="preserve"> and </w:t>
+            </w:r>
+            <w:proofErr w:type="spellStart"/>
+            <w:r>
+              <w:t>mrna_capture</w:t>
+            </w:r>
+            <w:proofErr w:type="spellEnd"/>
+            <w:r>
+              <w:t xml:space="preserve"> data </w:t>
             </w:r>
             <w:r>
               <w:t xml:space="preserve">from wide to long form and </w:t>
@@ -2459,7 +2335,15 @@
           </w:tcPr>
           <w:p>
             <w:r>
-              <w:t xml:space="preserve">Converts the data_cna data </w:t>
+              <w:t xml:space="preserve">Converts the </w:t>
+            </w:r>
+            <w:proofErr w:type="spellStart"/>
+            <w:r>
+              <w:t>data_cna</w:t>
+            </w:r>
+            <w:proofErr w:type="spellEnd"/>
+            <w:r>
+              <w:t xml:space="preserve"> data </w:t>
             </w:r>
             <w:r>
               <w:t xml:space="preserve">from </w:t>

</xml_diff>